<commit_message>
Remove security clearance references from profile and CV
Removes every mention of clearance level and status (AGSVA NV1, NV1,
AGSVA Baseline, "Defence-cleared", "security clearance") from the EN,
PL and ZH pages (meta, hero, body, role line, timeline, credentials),
the README and the linked resume .docx, as required by Direction
003-2025 on online disclosure of security clearances.

Co-Authored-By: Claude Opus 5.5 <noreply@anthropic.com>
</commit_message>
<xml_diff>
--- a/files/Christopher_Tyl_Resume_2026.docx
+++ b/files/Christopher_Tyl_Resume_2026.docx
@@ -15,7 +15,7 @@
         <w:rPr>
           <w:b/>
         </w:rPr>
-        <w:t>Data &amp; AI Leader (NV1) · Author · Builder of Mesh Infrastructure for Human + Non-Human Teams</w:t>
+        <w:t>Data &amp; AI Leader · Author · Builder of Mesh Infrastructure for Human + Non-Human Teams</w:t>
       </w:r>
     </w:p>
     <w:p>
@@ -25,16 +25,7 @@
     </w:p>
     <w:p>
       <w:r>
-        <w:t xml:space="preserve">Australian citizen · AGSVA </w:t>
-      </w:r>
-      <w:r>
-        <w:rPr>
-          <w:b/>
-        </w:rPr>
-        <w:t>NV1</w:t>
-      </w:r>
-      <w:r>
-        <w:t xml:space="preserve"> · English C2 · Polish C2 · German A1 · Available 3 weeks</w:t>
+        <w:t xml:space="preserve">Australian citizen · English C2 · Polish C2 · German A1 · Available 3 weeks</w:t>
       </w:r>
     </w:p>
     <w:p>
@@ -54,7 +45,7 @@
     </w:p>
     <w:p>
       <w:r>
-        <w:t xml:space="preserve">Data &amp; AI leader with 20 years' operating experience across telecommunications, public sector and Defence-cleared environments. Authored institutional governance frameworks (DAMA-DMBOK, ISO 27001), built greenfield Azure SQL infrastructure, and productionised the AI sentiment-analysis workflow that moved Wodonga TAFE's stakeholder insight cadence from monthly to weekly. As Diamond11 (sole trader since Aug 2023) has engineered persistent-memory and mesh-messaging infrastructure for human + non-human teams, co-authored a self-published trilogy with named AI co-authors, and is launching meshbook.org on 15 May 2026 — the first platform to enforce A-C-P (Authored / Chimeric / Pleiadic) authorship transparency at the database schema level. Operating already in the AI phase Microsoft has not yet named: </w:t>
+        <w:t xml:space="preserve">Data &amp; AI leader with 20 years' operating experience across telecommunications, public sector and Defence training environments. Authored institutional governance frameworks (DAMA-DMBOK, ISO 27001), built greenfield Azure SQL infrastructure, and productionised the AI sentiment-analysis workflow that moved Wodonga TAFE's stakeholder insight cadence from monthly to weekly. As Diamond11 (sole trader since Aug 2023) has engineered persistent-memory and mesh-messaging infrastructure for human + non-human teams, co-authored a self-published trilogy with named AI co-authors, and is launching meshbook.org on 15 May 2026 — the first platform to enforce A-C-P (Authored / Chimeric / Pleiadic) authorship transparency at the database schema level. Operating already in the AI phase Microsoft has not yet named: </w:t>
       </w:r>
       <w:r>
         <w:rPr>
@@ -166,7 +157,7 @@
         <w:rPr>
           <w:i/>
         </w:rPr>
-        <w:t>Aug 2024 – present · Wodonga, VIC · Hybrid · NV1</w:t>
+        <w:t>Aug 2024 – present · Wodonga, VIC · Hybrid</w:t>
       </w:r>
     </w:p>
     <w:p>
@@ -632,7 +623,7 @@
         <w:rPr>
           <w:i/>
         </w:rPr>
-        <w:t>Nov 2022 – Feb 2023 · Sydney · Hybrid · AGSVA Baseline</w:t>
+        <w:t>Nov 2022 – Feb 2023 · Sydney · Hybrid</w:t>
       </w:r>
     </w:p>
     <w:p>
@@ -687,7 +678,7 @@
         <w:rPr>
           <w:i/>
         </w:rPr>
-        <w:t>Aug 2011 – Jul 2022 · 11 years · Sydney · AGSVA Baseline</w:t>
+        <w:t>Aug 2011 – Jul 2022 · 11 years · Sydney</w:t>
       </w:r>
     </w:p>
     <w:p>

</xml_diff>